<commit_message>
migrate risk_premium to verbal_trial
</commit_message>
<xml_diff>
--- a/document_templates/Contracts/particular/contract_particular.docx
+++ b/document_templates/Contracts/particular/contract_particular.docx
@@ -3064,8 +3064,6 @@
         </w:rPr>
         <w:t>6</w:t>
       </w:r>
-      <w:bookmarkStart w:id="9" w:name="_GoBack"/>
-      <w:bookmarkEnd w:id="9"/>
       <w:r>
         <w:rPr>
           <w:rFonts w:hint="default" w:ascii="Times New Roman" w:hAnsi="Times New Roman" w:cs="Times New Roman"/>
@@ -4692,6 +4690,7 @@
           <w:highlight w:val="none"/>
         </w:rPr>
       </w:pPr>
+      <w:bookmarkStart w:id="9" w:name="_GoBack"/>
     </w:p>
     <w:p>
       <w:pPr>
@@ -4725,17 +4724,13 @@
           <w:b/>
           <w:bCs/>
           <w:iCs/>
-          <w:color w:val="000000"/>
-          <w:sz w:val="24"/>
-          <w:szCs w:val="24"/>
-          <w:lang w:val="it-IT"/>
-        </w:rPr>
-        <w:t xml:space="preserve">Mme. Ameh D. MESSANGAN </w:t>
-      </w:r>
-    </w:p>
-    <w:p>
-      <w:pPr>
-        <w:spacing w:after="0"/>
+          <w:sz w:val="24"/>
+          <w:szCs w:val="24"/>
+          <w:lang w:val="en-US"/>
+        </w:rPr>
+        <w:t xml:space="preserve">                  </w:t>
+      </w:r>
+      <w:r>
         <w:rPr>
           <w:rFonts w:hint="default" w:ascii="Times New Roman" w:hAnsi="Times New Roman" w:cs="Times New Roman"/>
           <w:b/>
@@ -4744,9 +4739,14 @@
           <w:color w:val="000000"/>
           <w:sz w:val="24"/>
           <w:szCs w:val="24"/>
-        </w:rPr>
-      </w:pPr>
-      <w:r>
+          <w:lang w:val="it-IT"/>
+        </w:rPr>
+        <w:t xml:space="preserve">Mme. Ameh D. MESSANGAN </w:t>
+      </w:r>
+    </w:p>
+    <w:p>
+      <w:pPr>
+        <w:spacing w:after="0"/>
         <w:rPr>
           <w:rFonts w:hint="default" w:ascii="Times New Roman" w:hAnsi="Times New Roman" w:cs="Times New Roman"/>
           <w:b/>
@@ -4755,20 +4755,8 @@
           <w:color w:val="000000"/>
           <w:sz w:val="24"/>
           <w:szCs w:val="24"/>
-          <w:lang w:val="it-IT"/>
-        </w:rPr>
-        <w:t xml:space="preserve">                                                                                   </w:t>
-      </w:r>
-      <w:r>
-        <w:rPr>
-          <w:rFonts w:hint="default" w:ascii="Times New Roman" w:hAnsi="Times New Roman" w:cs="Times New Roman"/>
-          <w:iCs/>
-          <w:color w:val="000000"/>
-          <w:sz w:val="24"/>
-          <w:szCs w:val="24"/>
-        </w:rPr>
-        <w:t>épse</w:t>
-      </w:r>
+        </w:rPr>
+      </w:pPr>
       <w:r>
         <w:rPr>
           <w:rFonts w:hint="default" w:ascii="Times New Roman" w:hAnsi="Times New Roman" w:cs="Times New Roman"/>
@@ -4778,30 +4766,88 @@
           <w:color w:val="000000"/>
           <w:sz w:val="24"/>
           <w:szCs w:val="24"/>
-        </w:rPr>
-        <w:t xml:space="preserve"> AMEDEMEGNAH </w:t>
-      </w:r>
-    </w:p>
-    <w:p>
-      <w:pPr>
-        <w:rPr>
-          <w:rFonts w:hint="default" w:ascii="Times New Roman" w:hAnsi="Times New Roman" w:cs="Times New Roman"/>
+          <w:lang w:val="it-IT"/>
+        </w:rPr>
+        <w:t xml:space="preserve">                                                                                </w:t>
+      </w:r>
+      <w:r>
+        <w:rPr>
+          <w:rFonts w:hint="default" w:ascii="Times New Roman" w:hAnsi="Times New Roman" w:cs="Times New Roman"/>
+          <w:b/>
           <w:bCs/>
           <w:iCs/>
-          <w:sz w:val="24"/>
-          <w:szCs w:val="24"/>
-        </w:rPr>
-      </w:pPr>
-      <w:r>
-        <w:rPr>
-          <w:rFonts w:hint="default" w:ascii="Times New Roman" w:hAnsi="Times New Roman" w:cs="Times New Roman"/>
+          <w:color w:val="000000"/>
+          <w:sz w:val="24"/>
+          <w:szCs w:val="24"/>
+          <w:lang w:val="en-US"/>
+        </w:rPr>
+        <w:t xml:space="preserve">                  </w:t>
+      </w:r>
+      <w:r>
+        <w:rPr>
+          <w:rFonts w:hint="default" w:ascii="Times New Roman" w:hAnsi="Times New Roman" w:cs="Times New Roman"/>
+          <w:iCs/>
+          <w:color w:val="000000"/>
+          <w:sz w:val="24"/>
+          <w:szCs w:val="24"/>
+        </w:rPr>
+        <w:t>épse</w:t>
+      </w:r>
+      <w:r>
+        <w:rPr>
+          <w:rFonts w:hint="default" w:ascii="Times New Roman" w:hAnsi="Times New Roman" w:cs="Times New Roman"/>
+          <w:b/>
           <w:bCs/>
           <w:iCs/>
-          <w:sz w:val="24"/>
-          <w:szCs w:val="24"/>
-        </w:rPr>
-        <w:t>Head Crédit                                                           Responsable juridique</w:t>
-      </w:r>
+          <w:color w:val="000000"/>
+          <w:sz w:val="24"/>
+          <w:szCs w:val="24"/>
+        </w:rPr>
+        <w:t xml:space="preserve"> AMEDEMEGNAH </w:t>
+      </w:r>
+    </w:p>
+    <w:p>
+      <w:pPr>
+        <w:rPr>
+          <w:rFonts w:hint="default" w:ascii="Times New Roman" w:hAnsi="Times New Roman" w:cs="Times New Roman"/>
+          <w:bCs/>
+          <w:iCs/>
+          <w:sz w:val="24"/>
+          <w:szCs w:val="24"/>
+        </w:rPr>
+      </w:pPr>
+      <w:r>
+        <w:rPr>
+          <w:rFonts w:hint="default" w:ascii="Times New Roman" w:hAnsi="Times New Roman" w:cs="Times New Roman"/>
+          <w:bCs/>
+          <w:iCs/>
+          <w:sz w:val="24"/>
+          <w:szCs w:val="24"/>
+        </w:rPr>
+        <w:t xml:space="preserve">Head Crédit                                                           </w:t>
+      </w:r>
+      <w:r>
+        <w:rPr>
+          <w:rFonts w:hint="default" w:ascii="Times New Roman" w:hAnsi="Times New Roman" w:cs="Times New Roman"/>
+          <w:bCs/>
+          <w:iCs/>
+          <w:sz w:val="24"/>
+          <w:szCs w:val="24"/>
+          <w:lang w:val="en-US"/>
+        </w:rPr>
+        <w:t xml:space="preserve">                   </w:t>
+      </w:r>
+      <w:r>
+        <w:rPr>
+          <w:rFonts w:hint="default" w:ascii="Times New Roman" w:hAnsi="Times New Roman" w:cs="Times New Roman"/>
+          <w:bCs/>
+          <w:iCs/>
+          <w:sz w:val="24"/>
+          <w:szCs w:val="24"/>
+        </w:rPr>
+        <w:t>Responsable juridique</w:t>
+      </w:r>
+      <w:bookmarkEnd w:id="9"/>
     </w:p>
     <w:p>
       <w:pPr>

</xml_diff>